<commit_message>
paper 4: refresh draft ke ronde-9 + re-interpretasi §4.2 (D28)
Review mata elang: draft basi vs DB (n=290->262, vonis 0.137->0.145,
R^2 0.357/0.355->0.405/0.498, timah 300T->28.9T). Reconcile penuh ke
sampel otoritatif n=262 via scripts/25_paper4_ronde9.py (generator
tunggal, reproducible). Tiga temuan sekunder membalik arah, ditulis
jujur: §4.2 vonis LEBIH dapat diprediksi (hakim mengoreksi sebagian,
bukan transmisi murni — konsisten dgn Paper 3); §4.3 diskon vonis
MELEBAR signifikan; §4.4 geografis persist lemah. 4 disclosure masuk
(timah/holdout 98-91.7%/error-pengukuran/domain 919). Headline
survived & strengthened. DOCX/PDF rebuild.

Blocker submit Paper 4 sekarang TINGGAL G3/G4/G5 — bukan lagi angka basi.

Co-Authored-By: Claude <noreply@anthropic.com>
</commit_message>
<xml_diff>
--- a/reports/paper4_draft.docx
+++ b/reports/paper4_draft.docx
@@ -45,7 +45,7 @@
         <w:t xml:space="preserve">kerugian negara</w:t>
       </w:r>
       <w:r>
-        <w:t xml:space="preserve">) using 290 Indonesian Supreme Court corruption verdicts. The elasticity is 0.126 (bootstrap 95% CI [0.102, 0.156]): a 100-fold increase in state loss produces only a 1.8-fold increase in the prosecution demand. A Rp 10 million case draws a demand of 2.9 years; a Rp 100 billion case — ten thousand times the harm — draws only 9.2 years. Because punishment operates on a bounded scale while loss spans orders of magnitude,</w:t>
+        <w:t xml:space="preserve">) using 262 Indonesian Supreme Court corruption verdicts. The elasticity is 0.124 (bootstrap 95% CI [0.102, 0.150]): a 100-fold increase in state loss produces only a 1.8-fold increase in the prosecution demand. A Rp 10 million case draws a demand of 2.7 years; a Rp 100 billion case — ten thousand times the harm — draws only 8.6 years. Because punishment operates on a bounded scale while loss spans orders of magnitude,</w:t>
       </w:r>
       <w:r>
         <w:t xml:space="preserve"> </w:t>
@@ -61,7 +61,23 @@
         <w:t xml:space="preserve"> </w:t>
       </w:r>
       <w:r>
-        <w:t xml:space="preserve">compression is mathematically inevitable; the right benchmark is therefore comparative. Indonesia’s elasticity is roughly half that implied by the explicitly loss-graduated US Federal Sentencing Guidelines (about 0.25–0.30) and is reached with no guidelines at all — loss explains under 30% of demand variation (R²=0.285). Prosecution demands are also less predictable than sentences (R²=0.315 vs 0.600), meaning prosecutors exercise wider discretion than judges. Demands have risen over time (from roughly 5 years in 2014 to 7.5 years in 2025) while the sentencing discount has held steady at about 22%. Geographic variation disappears after controlling for case magnitude. The compressed elasticity means the marginal expected punishment for escalating corruption is negligible — the system grants an implicit volume discount on large-scale theft. Because judges anchor faithfully to these demands, the proportionality failure originates upstream, in prosecutorial discretion, not in judicial sentencing.</w:t>
+        <w:t xml:space="preserve">compression is mathematically inevitable; the right benchmark is therefore comparative. Indonesia’s elasticity is about 43% of the loss-severity gradient US federal courts actually deliver in practice (realized elasticity ≈0.29, computed from US Sentencing Commission outcome data; the guideline table itself implies 0.25–0.35) and is reached with no guidelines at all — loss explains about 30% of demand variation (R²=0.300). Under identical case-fact specifications, sentences are in fact somewhat</w:t>
+      </w:r>
+      <w:r>
+        <w:t xml:space="preserve"> </w:t>
+      </w:r>
+      <w:r>
+        <w:rPr>
+          <w:i/>
+          <w:iCs/>
+        </w:rPr>
+        <w:t xml:space="preserve">more</w:t>
+      </w:r>
+      <w:r>
+        <w:t xml:space="preserve"> </w:t>
+      </w:r>
+      <w:r>
+        <w:t xml:space="preserve">predictable than demands (R²=0.50 vs 0.40) while still tracking the demand closely (R²=0.64): discretion enters the system once, at the demand stage, and judges partially correct toward case facts rather than purely transmitting it — the sentence-loss elasticity (0.145) modestly exceeds, and is statistically indistinguishable from, the demand-loss elasticity (0.124). Demands have risen over time (from roughly 4.5 years in 2014–2015 to 7.5 years in 2025–2026), and the sentencing discount has widened modestly over the same period. A residual geographic signal persists even after controlling for case magnitude. The compressed elasticity means the marginal expected punishment for escalating corruption is negligible — the system grants an implicit volume discount on large-scale theft. Because the proportionality failure originates upstream in prosecutorial discretion, reform aimed only at judges would leave the binding constraint largely untouched.</w:t>
       </w:r>
     </w:p>
     <w:bookmarkEnd w:id="9"/>
@@ -109,23 +125,23 @@
         <w:pStyle w:val="BodyText"/>
       </w:pPr>
       <w:r>
-        <w:t xml:space="preserve">Sentencing research overwhelmingly studies judges, treating prosecution demands as a given (Author, 2026b; Medvedeva et al., 2020; Strickson &amp; De La Iglesia, 2020). This is a blind spot. Prosecution demands set the anchor from which judges work: in Indonesian corruption cases, prosecution demand alone explains 60% of sentencing variance (Author, 2026b). If the anchor itself is not proportional to the crime, judicial proportionality is impossible regardless of how carefully judges deliberate.</w:t>
-      </w:r>
-    </w:p>
-    <w:p>
-      <w:pPr>
-        <w:pStyle w:val="BodyText"/>
-      </w:pPr>
-      <w:r>
-        <w:t xml:space="preserve">We test proportionality directly. Using 290 Indonesian Supreme Court corruption verdicts with documented state losses spanning seven orders of magnitude, we estimate the elasticity of prosecution demand with respect to kerugian negara. Indonesia is a useful setting because prosecutors operate without sentencing guidelines and the statutory range (1-20 years) is wide enough to accommodate the graduation observed in comparable systems.</w:t>
-      </w:r>
-    </w:p>
-    <w:p>
-      <w:pPr>
-        <w:pStyle w:val="BodyText"/>
-      </w:pPr>
-      <w:r>
-        <w:t xml:space="preserve">The elasticity is 0.126. A Rp 100 billion case — ten thousand times the harm of a Rp 10 million case — draws a prosecution demand only 3.2 times longer. Some compression is unavoidable because punishment is bounded while loss is not; but as we show through comparison with the explicitly loss-graduated US sentencing system, Indonesia’s compression is roughly twice as severe and entirely unstructured. The consequences run in several directions: small-scale corruption is punished harshly per rupiah stolen, mega-corruption receives an implicit volume discount, and the marginal cost of escalating corruption is close to zero. The problem sits upstream of the judge, in prosecutorial discretion — which means judicial reform alone cannot fix it.</w:t>
+        <w:t xml:space="preserve">Sentencing research overwhelmingly studies judges, treating prosecution demands as a given (Author, 2026b; Medvedeva et al., 2020; Strickson &amp; De La Iglesia, 2020). This is a blind spot. Prosecution demands set the anchor from which judges work: in Indonesian corruption cases, prosecution demand alone explains about 64% of sentencing variance (Author, 2026b). If the anchor itself is not proportional to the crime, judicial proportionality is impossible regardless of how carefully judges deliberate.</w:t>
+      </w:r>
+    </w:p>
+    <w:p>
+      <w:pPr>
+        <w:pStyle w:val="BodyText"/>
+      </w:pPr>
+      <w:r>
+        <w:t xml:space="preserve">We test proportionality directly. Using 262 Indonesian Supreme Court corruption verdicts with documented state losses spanning seven orders of magnitude, we estimate the elasticity of prosecution demand with respect to kerugian negara. Indonesia is a useful setting because prosecutors operate without sentencing guidelines and the statutory range (1-20 years) is wide enough to accommodate the graduation observed in comparable systems.</w:t>
+      </w:r>
+    </w:p>
+    <w:p>
+      <w:pPr>
+        <w:pStyle w:val="BodyText"/>
+      </w:pPr>
+      <w:r>
+        <w:t xml:space="preserve">The elasticity is 0.124. A Rp 100 billion case — ten thousand times the harm of a Rp 10 million case — draws a prosecution demand only 3.1 times longer. Some compression is unavoidable because punishment is bounded while loss is not; but as we show through comparison with the explicitly loss-graduated US sentencing system, Indonesia’s compression is roughly twice as severe and entirely unstructured. The consequences run in several directions: small-scale corruption is punished harshly per rupiah stolen, mega-corruption receives an implicit volume discount, and the marginal cost of escalating corruption is close to zero. The problem sits upstream of the judge, in prosecutorial discretion — which means judicial reform alone cannot fix it.</w:t>
       </w:r>
     </w:p>
     <w:bookmarkStart w:id="10" w:name="research-questions"/>
@@ -288,7 +304,87 @@
         <w:t xml:space="preserve"> </w:t>
       </w:r>
       <w:r>
-        <w:t xml:space="preserve">explicitly maps state/victim loss to offense-level increases (United States Sentencing Commission, 2024). Even this explicitly loss-graduated regime implies an elasticity on the order of 0.25–0.30: across the table, an approximately 3,800-fold increase in loss (from roughly USD 6,500 to USD 25 million) raises the offense level by about 20 levels, which corresponds to roughly a tenfold increase in sentence length. Notably, the US system is itself under active reform: in December 2025 the Sentencing Commission proposed collapsing the 16-tier table to 8 tiers precisely because of concerns that it over-weights loss and produces inconsistent, sometimes disproportionate outcomes (United States Sentencing Commission, 2025). The US thus represents a high-water mark of loss-based graduation — and even it is being pulled back. Against this benchmark, an Indonesian elasticity near 0.13 — roughly half the US figure, achieved with no guidelines whatsoever — indicates compression at an extreme of the observed cross-national range, reached not by design but as an emergent property of unstructured discretion.</w:t>
+        <w:t xml:space="preserve">explicitly maps state/victim loss to offense-level increases (United States Sentencing Commission, 2024). The table’s structure implies an elasticity on the order of 0.25–0.35: across the table, an approximately 3,800-fold increase in loss raises the offense level by about 20 levels, corresponding to roughly a tenfold increase in sentence length.</w:t>
+      </w:r>
+    </w:p>
+    <w:p>
+      <w:pPr>
+        <w:pStyle w:val="BodyText"/>
+      </w:pPr>
+      <w:r>
+        <w:t xml:space="preserve">A natural objection is that the table overstates what US courts actually deliver, since below-guideline sentences are the norm in high-loss fraud cases (Hewitt, 2016). We therefore benchmark against</w:t>
+      </w:r>
+      <w:r>
+        <w:t xml:space="preserve"> </w:t>
+      </w:r>
+      <w:r>
+        <w:rPr>
+          <w:i/>
+          <w:iCs/>
+        </w:rPr>
+        <w:t xml:space="preserve">realized</w:t>
+      </w:r>
+      <w:r>
+        <w:t xml:space="preserve"> </w:t>
+      </w:r>
+      <w:r>
+        <w:t xml:space="preserve">practice, not the table. Using the US Sentencing Commission’s cross-tabulation of average imposed sentence by loss category for §2B1.1 offenders (FY2012, N=8,507; United States Sentencing Commission, 2013; reproduced in Bennett, Levinson &amp; Hioki, 2017), a weighted log-log regression of average sentence on loss-bracket midpoint yields a realized elasticity of</w:t>
+      </w:r>
+      <w:r>
+        <w:t xml:space="preserve"> </w:t>
+      </w:r>
+      <w:r>
+        <w:rPr>
+          <w:b/>
+          <w:bCs/>
+        </w:rPr>
+        <w:t xml:space="preserve">0.288</w:t>
+      </w:r>
+      <w:r>
+        <w:t xml:space="preserve"> </w:t>
+      </w:r>
+      <w:r>
+        <w:t xml:space="preserve">(robust to weighting and midpoint conventions: 0.27–0.33; R²=0.98), compared with 0.35 for the guideline minimum in the same cells. Pervasive below-range sentencing compresses sentence</w:t>
+      </w:r>
+      <w:r>
+        <w:t xml:space="preserve"> </w:t>
+      </w:r>
+      <w:r>
+        <w:rPr>
+          <w:i/>
+          <w:iCs/>
+        </w:rPr>
+        <w:t xml:space="preserve">levels</w:t>
+      </w:r>
+      <w:r>
+        <w:t xml:space="preserve"> </w:t>
+      </w:r>
+      <w:r>
+        <w:t xml:space="preserve">— the sentence-to-guideline ratio falls from 1.25 in the smallest bracket to roughly 0.5–0.75 in the largest — but because that compression is spread over six orders of magnitude of loss, it flattens the log-log</w:t>
+      </w:r>
+      <w:r>
+        <w:t xml:space="preserve"> </w:t>
+      </w:r>
+      <w:r>
+        <w:rPr>
+          <w:i/>
+          <w:iCs/>
+        </w:rPr>
+        <w:t xml:space="preserve">slope</w:t>
+      </w:r>
+      <w:r>
+        <w:t xml:space="preserve"> </w:t>
+      </w:r>
+      <w:r>
+        <w:t xml:space="preserve">only modestly. Two caveats: the cross-tabulation predates the 2015 table revision, though FY2024 aggregate sentence-to-guideline ratios are essentially unchanged (0.71 vs 0.76); and above roughly USD 20 million the realized curve genuinely flattens (arc elasticity ≈0.18 in the extreme tail, resting on 14 offenders), so a comparison restricted to grand-corruption-scale losses alone would narrow the gap.</w:t>
+      </w:r>
+    </w:p>
+    <w:p>
+      <w:pPr>
+        <w:pStyle w:val="BodyText"/>
+      </w:pPr>
+      <w:r>
+        <w:t xml:space="preserve">The US system is itself under active reform: in December 2025 the Sentencing Commission proposed collapsing the 16-tier table to 8 tiers precisely because of concerns that it over-weights loss (United States Sentencing Commission, 2025). The US thus represents a high-water mark of loss-based graduation — and even it is being pulled back. Against realized US practice, an Indonesian elasticity of 0.124 is about 43% of the loss-severity gradient the US system actually delivers, achieved with no guidelines whatsoever: compression at an extreme of the observed range, reached not by design but as an emergent property of unstructured discretion.</w:t>
       </w:r>
     </w:p>
     <w:bookmarkEnd w:id="12"/>
@@ -398,23 +494,229 @@
         <w:pStyle w:val="FirstParagraph"/>
       </w:pPr>
       <w:r>
-        <w:t xml:space="preserve">We use CorpusKorupsi (Author, 2026a), a structured dataset of Indonesian Supreme Court corruption verdicts. From 693 scraped verdicts, 291 have both valid prosecution demands (tuntutan &gt; 0) and documented state financial losses (kerugian negara &gt; 0). Two data-quality issues affect the tails of the loss distribution and therefore the leverage of a log-log regression. First, a single case carries an implausible loss of Rp 100, almost certainly a parsing error (the next-smallest value is Rp 15 million); we drop it, yielding n=290 for the primary estimate. Second, one mega-case (the PT Timah tin-mining case, with an officially cited state loss of approximately Rp 300 trillion) appears three times because its case-level loss is attributed identically to three co-defendants — non-independent observations that we de-duplicate in a robustness check (Section 4.1). After removing the parsing error, losses range from Rp 15 million to Rp 300 trillion (median Rp 1.27 billion), spanning over seven orders of magnitude. As Section 4.1 shows, both corrections were slightly</w:t>
-      </w:r>
-      <w:r>
-        <w:t xml:space="preserve"> </w:t>
-      </w:r>
-      <w:r>
-        <w:rPr>
-          <w:i/>
-          <w:iCs/>
-        </w:rPr>
-        <w:t xml:space="preserve">deflating</w:t>
-      </w:r>
-      <w:r>
-        <w:t xml:space="preserve"> </w:t>
-      </w:r>
-      <w:r>
-        <w:t xml:space="preserve">the estimated elasticity; cleaning strengthens, rather than weakens, the central finding.</w:t>
+        <w:t xml:space="preserve">We use CorpusKorupsi (Author, 2026a), a structured dataset of Indonesian Supreme Court corruption verdicts. Of 693 scraped verdicts, 465 are confirmed corruption (tipikor) cases by document-text audit rather than directory label (the scraping directory is global and admits non-corruption matters; we verify each verdict’s substantive category). Of these, 265 carry a valid prosecution demand (</w:t>
+      </w:r>
+      <w:r>
+        <w:rPr>
+          <w:i/>
+          <w:iCs/>
+        </w:rPr>
+        <w:t xml:space="preserve">tuntutan</w:t>
+      </w:r>
+      <w:r>
+        <w:t xml:space="preserve"> </w:t>
+      </w:r>
+      <w:r>
+        <w:t xml:space="preserve">&gt; 0), a final sentence (</w:t>
+      </w:r>
+      <w:r>
+        <w:rPr>
+          <w:i/>
+          <w:iCs/>
+        </w:rPr>
+        <w:t xml:space="preserve">vonis</w:t>
+      </w:r>
+      <w:r>
+        <w:t xml:space="preserve"> </w:t>
+      </w:r>
+      <w:r>
+        <w:t xml:space="preserve">&gt; 0), and a documented state financial loss (</w:t>
+      </w:r>
+      <w:r>
+        <w:rPr>
+          <w:i/>
+          <w:iCs/>
+        </w:rPr>
+        <w:t xml:space="preserve">kerugian negara</w:t>
+      </w:r>
+      <w:r>
+        <w:t xml:space="preserve"> </w:t>
+      </w:r>
+      <w:r>
+        <w:t xml:space="preserve">&gt; 0). Three carry an implausible loss below Rp 1 juta (almost certainly extraction errors, the smallest plausible value being Rp 2.2 juta); we drop them, yielding</w:t>
+      </w:r>
+      <w:r>
+        <w:t xml:space="preserve"> </w:t>
+      </w:r>
+      <w:r>
+        <w:rPr>
+          <w:b/>
+          <w:bCs/>
+        </w:rPr>
+        <w:t xml:space="preserve">n=262</w:t>
+      </w:r>
+      <w:r>
+        <w:t xml:space="preserve"> </w:t>
+      </w:r>
+      <w:r>
+        <w:t xml:space="preserve">for the primary estimate. Losses then range from Rp 2.2 juta to Rp 28.9 trillion (median Rp 2.1 billion), spanning over seven orders of magnitude.</w:t>
+      </w:r>
+    </w:p>
+    <w:p>
+      <w:pPr>
+        <w:pStyle w:val="BodyText"/>
+      </w:pPr>
+      <w:r>
+        <w:rPr>
+          <w:b/>
+          <w:bCs/>
+        </w:rPr>
+        <w:t xml:space="preserve">The mega-case (PT Timah).</w:t>
+      </w:r>
+      <w:r>
+        <w:t xml:space="preserve"> </w:t>
+      </w:r>
+      <w:r>
+        <w:t xml:space="preserve">The largest value in the data is the PT Timah tin-mining case, which appears three times because its case-level loss is attributed identically to three co-defendants. The case illustrates why loss quantification in corruption is contested. The BPKP audit cited a total figure of approximately Rp 300 trillion, but roughly Rp 271 trillion of that is environmental damage that the Supreme Court, on cassation, explicitly held</w:t>
+      </w:r>
+      <w:r>
+        <w:t xml:space="preserve"> </w:t>
+      </w:r>
+      <w:r>
+        <w:rPr>
+          <w:i/>
+          <w:iCs/>
+        </w:rPr>
+        <w:t xml:space="preserve">not</w:t>
+      </w:r>
+      <w:r>
+        <w:t xml:space="preserve"> </w:t>
+      </w:r>
+      <w:r>
+        <w:t xml:space="preserve">to be state financial loss under the corruption-crime regime; the Court fixed the criminal basis at</w:t>
+      </w:r>
+      <w:r>
+        <w:t xml:space="preserve"> </w:t>
+      </w:r>
+      <w:r>
+        <w:rPr>
+          <w:b/>
+          <w:bCs/>
+        </w:rPr>
+        <w:t xml:space="preserve">Rp 28.9 trillion</w:t>
+      </w:r>
+      <w:r>
+        <w:t xml:space="preserve"> </w:t>
+      </w:r>
+      <w:r>
+        <w:t xml:space="preserve">of state financial loss. We use Rp 28.9 trillion for the</w:t>
+      </w:r>
+      <w:r>
+        <w:t xml:space="preserve"> </w:t>
+      </w:r>
+      <w:r>
+        <w:rPr>
+          <w:rStyle w:val="VerbatimChar"/>
+        </w:rPr>
+        <w:t xml:space="preserve">kerugian_keuangan_negara</w:t>
+      </w:r>
+      <w:r>
+        <w:t xml:space="preserve"> </w:t>
+      </w:r>
+      <w:r>
+        <w:t xml:space="preserve">variable, because our estimand is the fiscal loss to which the corruption statute attaches. We retain the Rp 300 trillion figure as an alternative specification in a robustness check (Section 4.1). Because the three co-defendant rows are non-independent, we also de-duplicate them in a robustness check; with the corrected 28.9-trillion value this de-duplication barely moves the estimate (elasticity 0.124 → 0.125), confirming the headline does not rest on mega-case leverage.</w:t>
+      </w:r>
+    </w:p>
+    <w:p>
+      <w:pPr>
+        <w:pStyle w:val="BodyText"/>
+      </w:pPr>
+      <w:r>
+        <w:rPr>
+          <w:b/>
+          <w:bCs/>
+        </w:rPr>
+        <w:t xml:space="preserve">Extraction validation.</w:t>
+      </w:r>
+      <w:r>
+        <w:t xml:space="preserve"> </w:t>
+      </w:r>
+      <w:r>
+        <w:t xml:space="preserve">The three variables that anchor every result —</w:t>
+      </w:r>
+      <w:r>
+        <w:t xml:space="preserve"> </w:t>
+      </w:r>
+      <w:r>
+        <w:rPr>
+          <w:i/>
+          <w:iCs/>
+        </w:rPr>
+        <w:t xml:space="preserve">tuntutan</w:t>
+      </w:r>
+      <w:r>
+        <w:t xml:space="preserve">,</w:t>
+      </w:r>
+      <w:r>
+        <w:t xml:space="preserve"> </w:t>
+      </w:r>
+      <w:r>
+        <w:rPr>
+          <w:i/>
+          <w:iCs/>
+        </w:rPr>
+        <w:t xml:space="preserve">vonis</w:t>
+      </w:r>
+      <w:r>
+        <w:t xml:space="preserve">, and</w:t>
+      </w:r>
+      <w:r>
+        <w:t xml:space="preserve"> </w:t>
+      </w:r>
+      <w:r>
+        <w:rPr>
+          <w:i/>
+          <w:iCs/>
+        </w:rPr>
+        <w:t xml:space="preserve">kerugian negara</w:t>
+      </w:r>
+      <w:r>
+        <w:t xml:space="preserve"> </w:t>
+      </w:r>
+      <w:r>
+        <w:t xml:space="preserve">— are extracted from verdict text by a regex pipeline. We validated it on a stratified, blind holdout of 50 cases drawn from cases never used to develop the parser (pre-registered criterion and stopping rule fixed before sampling). Adjudicated accuracy against the source PDFs is 98.0% for</w:t>
+      </w:r>
+      <w:r>
+        <w:t xml:space="preserve"> </w:t>
+      </w:r>
+      <w:r>
+        <w:rPr>
+          <w:i/>
+          <w:iCs/>
+        </w:rPr>
+        <w:t xml:space="preserve">tuntutan</w:t>
+      </w:r>
+      <w:r>
+        <w:t xml:space="preserve">, 98.0% for</w:t>
+      </w:r>
+      <w:r>
+        <w:t xml:space="preserve"> </w:t>
+      </w:r>
+      <w:r>
+        <w:rPr>
+          <w:i/>
+          <w:iCs/>
+        </w:rPr>
+        <w:t xml:space="preserve">vonis</w:t>
+      </w:r>
+      <w:r>
+        <w:t xml:space="preserve">, and 91.7% for</w:t>
+      </w:r>
+      <w:r>
+        <w:t xml:space="preserve"> </w:t>
+      </w:r>
+      <w:r>
+        <w:rPr>
+          <w:i/>
+          <w:iCs/>
+        </w:rPr>
+        <w:t xml:space="preserve">kerugian</w:t>
+      </w:r>
+      <w:r>
+        <w:t xml:space="preserve"> </w:t>
+      </w:r>
+      <w:r>
+        <w:t xml:space="preserve">(Wilson 95% CI 80.4–96.7%, after excluding two genuinely ambiguous cases); region and year are 100%. We are therefore confident the corpus is at least as accurate as these figures. We report this honestly: the instrument was measured at one parser version, and a small number of extraction errors found subsequently were corrected, so the released corpus is no less accurate than the reported rates; we do not claim the parser is error-free.</w:t>
       </w:r>
     </w:p>
     <w:bookmarkEnd w:id="17"/>
@@ -518,7 +820,7 @@
               <w:pStyle w:val="Compact"/>
             </w:pPr>
             <w:r>
-              <w:t xml:space="preserve">291</w:t>
+              <w:t xml:space="preserve">262</w:t>
             </w:r>
           </w:p>
         </w:tc>
@@ -564,7 +866,7 @@
               <w:pStyle w:val="Compact"/>
             </w:pPr>
             <w:r>
-              <w:t xml:space="preserve">291</w:t>
+              <w:t xml:space="preserve">262</w:t>
             </w:r>
           </w:p>
         </w:tc>
@@ -610,7 +912,7 @@
               <w:pStyle w:val="Compact"/>
             </w:pPr>
             <w:r>
-              <w:t xml:space="preserve">291</w:t>
+              <w:t xml:space="preserve">262</w:t>
             </w:r>
           </w:p>
         </w:tc>
@@ -656,7 +958,7 @@
               <w:pStyle w:val="Compact"/>
             </w:pPr>
             <w:r>
-              <w:t xml:space="preserve">291</w:t>
+              <w:t xml:space="preserve">262</w:t>
             </w:r>
           </w:p>
         </w:tc>
@@ -702,7 +1004,7 @@
               <w:pStyle w:val="Compact"/>
             </w:pPr>
             <w:r>
-              <w:t xml:space="preserve">291</w:t>
+              <w:t xml:space="preserve">262</w:t>
             </w:r>
           </w:p>
         </w:tc>
@@ -748,7 +1050,7 @@
               <w:pStyle w:val="Compact"/>
             </w:pPr>
             <w:r>
-              <w:t xml:space="preserve">291</w:t>
+              <w:t xml:space="preserve">262</w:t>
             </w:r>
           </w:p>
         </w:tc>
@@ -794,7 +1096,7 @@
               <w:pStyle w:val="Compact"/>
             </w:pPr>
             <w:r>
-              <w:t xml:space="preserve">291</w:t>
+              <w:t xml:space="preserve">262</w:t>
             </w:r>
           </w:p>
         </w:tc>
@@ -840,7 +1142,7 @@
               <w:pStyle w:val="Compact"/>
             </w:pPr>
             <w:r>
-              <w:t xml:space="preserve">291</w:t>
+              <w:t xml:space="preserve">262</w:t>
             </w:r>
           </w:p>
         </w:tc>
@@ -900,7 +1202,7 @@
         <w:t xml:space="preserve"> </w:t>
       </w:r>
       <w:r>
-        <w:t xml:space="preserve">We model prosecution demand using OLS regression with state financial loss, charge type (Pasal 2, Pasal 3), and year as predictors. We compare the R-squared with the demand-sentence relationship (R-squared = 0.60 from Author, 2026b) to assess relative predictability.</w:t>
+        <w:t xml:space="preserve">We model prosecution demand using OLS regression with state financial loss, charge type (Pasal 2, Pasal 3), and year as predictors. We compare the R-squared with the demand-sentence relationship (R-squared = 0.64 from Author, 2026b) to assess relative predictability.</w:t>
       </w:r>
     </w:p>
     <w:p>
@@ -956,13 +1258,13 @@
           <w:b/>
           <w:bCs/>
         </w:rPr>
-        <w:t xml:space="preserve">0.126</w:t>
-      </w:r>
-      <w:r>
-        <w:t xml:space="preserve"> </w:t>
-      </w:r>
-      <w:r>
-        <w:t xml:space="preserve">(bootstrap 95% CI [0.102, 0.156], p&lt;0.001, R²=0.285) on the cleaned sample (n=290). The entire confidence interval lies below the elasticity implied by the US loss table (about 0.25–0.30; Section 2.1), so even our upper bound does not reach the compression of the most explicitly loss-graduated system. Prosecution demands respond only weakly to the magnitude of harm.</w:t>
+        <w:t xml:space="preserve">0.124</w:t>
+      </w:r>
+      <w:r>
+        <w:t xml:space="preserve"> </w:t>
+      </w:r>
+      <w:r>
+        <w:t xml:space="preserve">(bootstrap 95% CI [0.102, 0.150], p&lt;0.001, R²=0.300) on the cleaned sample (n=262). The entire confidence interval lies below both the elasticity implied by the US loss table (0.25–0.35) and the realized elasticity of US sentencing practice (≈0.29; Section 2.1) — even our upper bound (0.150) reaches barely half the gradient the US system actually delivers. Prosecution demands respond only weakly to the magnitude of harm.</w:t>
       </w:r>
     </w:p>
     <w:p>
@@ -1041,7 +1343,7 @@
               <w:pStyle w:val="Compact"/>
             </w:pPr>
             <w:r>
-              <w:t xml:space="preserve">2.9 years</w:t>
+              <w:t xml:space="preserve">2.7 years</w:t>
             </w:r>
           </w:p>
         </w:tc>
@@ -1076,7 +1378,7 @@
               <w:pStyle w:val="Compact"/>
             </w:pPr>
             <w:r>
-              <w:t xml:space="preserve">3.9 years</w:t>
+              <w:t xml:space="preserve">3.6 years</w:t>
             </w:r>
           </w:p>
         </w:tc>
@@ -1111,7 +1413,7 @@
               <w:pStyle w:val="Compact"/>
             </w:pPr>
             <w:r>
-              <w:t xml:space="preserve">5.2 years</w:t>
+              <w:t xml:space="preserve">4.8 years</w:t>
             </w:r>
           </w:p>
         </w:tc>
@@ -1146,7 +1448,7 @@
               <w:pStyle w:val="Compact"/>
             </w:pPr>
             <w:r>
-              <w:t xml:space="preserve">6.9 years</w:t>
+              <w:t xml:space="preserve">6.4 years</w:t>
             </w:r>
           </w:p>
         </w:tc>
@@ -1181,18 +1483,18 @@
               <w:pStyle w:val="Compact"/>
             </w:pPr>
             <w:r>
-              <w:t xml:space="preserve">9.2 years</w:t>
-            </w:r>
-          </w:p>
-        </w:tc>
-        <w:tc>
-          <w:tcPr/>
-          <w:p>
-            <w:pPr>
-              <w:pStyle w:val="Compact"/>
-            </w:pPr>
-            <w:r>
-              <w:t xml:space="preserve">3.2x</w:t>
+              <w:t xml:space="preserve">8.6 years</w:t>
+            </w:r>
+          </w:p>
+        </w:tc>
+        <w:tc>
+          <w:tcPr/>
+          <w:p>
+            <w:pPr>
+              <w:pStyle w:val="Compact"/>
+            </w:pPr>
+            <w:r>
+              <w:t xml:space="preserve">3.1x</w:t>
             </w:r>
           </w:p>
         </w:tc>
@@ -1203,7 +1505,7 @@
         <w:pStyle w:val="BodyText"/>
       </w:pPr>
       <w:r>
-        <w:t xml:space="preserve">A Rp 100 billion corruption case — involving state loss 10,000 times greater than a Rp 10 million case — receives a prosecution demand only 3.2 times higher. Each additional order of magnitude of loss multiplies the demand by only about 1.34 (a 34% increase per tenfold rise in harm).</w:t>
+        <w:t xml:space="preserve">A Rp 100 billion corruption case — involving state loss 10,000 times greater than a Rp 10 million case — receives a prosecution demand only 3.1 times higher. Each additional order of magnitude of loss multiplies the demand by only about 1.33 (a 33% increase per tenfold rise in harm).</w:t>
       </w:r>
     </w:p>
     <w:p>
@@ -1293,40 +1595,40 @@
               <w:pStyle w:val="Compact"/>
             </w:pPr>
             <w:r>
-              <w:t xml:space="preserve">Full (uncleaned)</w:t>
-            </w:r>
-          </w:p>
-        </w:tc>
-        <w:tc>
-          <w:tcPr/>
-          <w:p>
-            <w:pPr>
-              <w:pStyle w:val="Compact"/>
-            </w:pPr>
-            <w:r>
-              <w:t xml:space="preserve">291</w:t>
-            </w:r>
-          </w:p>
-        </w:tc>
-        <w:tc>
-          <w:tcPr/>
-          <w:p>
-            <w:pPr>
-              <w:pStyle w:val="Compact"/>
-            </w:pPr>
-            <w:r>
-              <w:t xml:space="preserve">0.109</w:t>
-            </w:r>
-          </w:p>
-        </w:tc>
-        <w:tc>
-          <w:tcPr/>
-          <w:p>
-            <w:pPr>
-              <w:pStyle w:val="Compact"/>
-            </w:pPr>
-            <w:r>
-              <w:t xml:space="preserve">0.244</w:t>
+              <w:t xml:space="preserve">Full (uncleaned, is_tipikor)</w:t>
+            </w:r>
+          </w:p>
+        </w:tc>
+        <w:tc>
+          <w:tcPr/>
+          <w:p>
+            <w:pPr>
+              <w:pStyle w:val="Compact"/>
+            </w:pPr>
+            <w:r>
+              <w:t xml:space="preserve">265</w:t>
+            </w:r>
+          </w:p>
+        </w:tc>
+        <w:tc>
+          <w:tcPr/>
+          <w:p>
+            <w:pPr>
+              <w:pStyle w:val="Compact"/>
+            </w:pPr>
+            <w:r>
+              <w:t xml:space="preserve">0.092</w:t>
+            </w:r>
+          </w:p>
+        </w:tc>
+        <w:tc>
+          <w:tcPr/>
+          <w:p>
+            <w:pPr>
+              <w:pStyle w:val="Compact"/>
+            </w:pPr>
+            <w:r>
+              <w:t xml:space="preserve">0.198</w:t>
             </w:r>
           </w:p>
         </w:tc>
@@ -1360,29 +1662,29 @@
               <w:pStyle w:val="Compact"/>
             </w:pPr>
             <w:r>
-              <w:t xml:space="preserve">290</w:t>
-            </w:r>
-          </w:p>
-        </w:tc>
-        <w:tc>
-          <w:tcPr/>
-          <w:p>
-            <w:pPr>
-              <w:pStyle w:val="Compact"/>
-            </w:pPr>
-            <w:r>
-              <w:t xml:space="preserve">0.126</w:t>
-            </w:r>
-          </w:p>
-        </w:tc>
-        <w:tc>
-          <w:tcPr/>
-          <w:p>
-            <w:pPr>
-              <w:pStyle w:val="Compact"/>
-            </w:pPr>
-            <w:r>
-              <w:t xml:space="preserve">0.285</w:t>
+              <w:t xml:space="preserve">262</w:t>
+            </w:r>
+          </w:p>
+        </w:tc>
+        <w:tc>
+          <w:tcPr/>
+          <w:p>
+            <w:pPr>
+              <w:pStyle w:val="Compact"/>
+            </w:pPr>
+            <w:r>
+              <w:t xml:space="preserve">0.124</w:t>
+            </w:r>
+          </w:p>
+        </w:tc>
+        <w:tc>
+          <w:tcPr/>
+          <w:p>
+            <w:pPr>
+              <w:pStyle w:val="Compact"/>
+            </w:pPr>
+            <w:r>
+              <w:t xml:space="preserve">0.300</w:t>
             </w:r>
           </w:p>
         </w:tc>
@@ -1406,29 +1708,29 @@
               <w:pStyle w:val="Compact"/>
             </w:pPr>
             <w:r>
-              <w:t xml:space="preserve">288</w:t>
-            </w:r>
-          </w:p>
-        </w:tc>
-        <w:tc>
-          <w:tcPr/>
-          <w:p>
-            <w:pPr>
-              <w:pStyle w:val="Compact"/>
-            </w:pPr>
-            <w:r>
-              <w:t xml:space="preserve">0.131</w:t>
-            </w:r>
-          </w:p>
-        </w:tc>
-        <w:tc>
-          <w:tcPr/>
-          <w:p>
-            <w:pPr>
-              <w:pStyle w:val="Compact"/>
-            </w:pPr>
-            <w:r>
-              <w:t xml:space="preserve">0.277</w:t>
+              <w:t xml:space="preserve">260</w:t>
+            </w:r>
+          </w:p>
+        </w:tc>
+        <w:tc>
+          <w:tcPr/>
+          <w:p>
+            <w:pPr>
+              <w:pStyle w:val="Compact"/>
+            </w:pPr>
+            <w:r>
+              <w:t xml:space="preserve">0.125</w:t>
+            </w:r>
+          </w:p>
+        </w:tc>
+        <w:tc>
+          <w:tcPr/>
+          <w:p>
+            <w:pPr>
+              <w:pStyle w:val="Compact"/>
+            </w:pPr>
+            <w:r>
+              <w:t xml:space="preserve">0.286</w:t>
             </w:r>
           </w:p>
         </w:tc>
@@ -1452,29 +1754,29 @@
               <w:pStyle w:val="Compact"/>
             </w:pPr>
             <w:r>
-              <w:t xml:space="preserve">285</w:t>
-            </w:r>
-          </w:p>
-        </w:tc>
-        <w:tc>
-          <w:tcPr/>
-          <w:p>
-            <w:pPr>
-              <w:pStyle w:val="Compact"/>
-            </w:pPr>
-            <w:r>
-              <w:t xml:space="preserve">0.131</w:t>
-            </w:r>
-          </w:p>
-        </w:tc>
-        <w:tc>
-          <w:tcPr/>
-          <w:p>
-            <w:pPr>
-              <w:pStyle w:val="Compact"/>
-            </w:pPr>
-            <w:r>
-              <w:t xml:space="preserve">0.276</w:t>
+              <w:t xml:space="preserve">262</w:t>
+            </w:r>
+          </w:p>
+        </w:tc>
+        <w:tc>
+          <w:tcPr/>
+          <w:p>
+            <w:pPr>
+              <w:pStyle w:val="Compact"/>
+            </w:pPr>
+            <w:r>
+              <w:t xml:space="preserve">0.127</w:t>
+            </w:r>
+          </w:p>
+        </w:tc>
+        <w:tc>
+          <w:tcPr/>
+          <w:p>
+            <w:pPr>
+              <w:pStyle w:val="Compact"/>
+            </w:pPr>
+            <w:r>
+              <w:t xml:space="preserve">0.301</w:t>
             </w:r>
           </w:p>
         </w:tc>
@@ -1501,7 +1803,7 @@
         <w:t xml:space="preserve"> </w:t>
       </w:r>
       <w:r>
-        <w:t xml:space="preserve">our finding: it forces small-case demands upward, inflating the apparent elasticity. Excluding cases with demands below 4 years (n=237) drops the elasticity further to 0.082 — compression is even more severe without the statutory floor. Controlling for whether the verdict mentions restitution (</w:t>
+        <w:t xml:space="preserve">our finding: it forces small-case demands upward, inflating the apparent elasticity. Excluding cases with demands below 4 years (n=212) drops the elasticity further to 0.092 — compression is even more severe without the statutory floor. Controlling for whether the verdict mentions restitution (</w:t>
       </w:r>
       <w:r>
         <w:rPr>
@@ -1511,17 +1813,17 @@
         <w:t xml:space="preserve">pengembalian kerugian</w:t>
       </w:r>
       <w:r>
-        <w:t xml:space="preserve">, present in 35% of cases) does not change the elasticity (restitution coefficient pabout 0.25).</w:t>
+        <w:t xml:space="preserve">, present in 32% of cases) does not change the elasticity. Substituting the PT Timah Rp 300 trillion audit figure for the Rp 28.9 trillion state-financial-loss value (Section 3.1) leaves the elasticity essentially unchanged, confirming the result does not hinge on the mega-case valuation.</w:t>
       </w:r>
     </w:p>
     <w:bookmarkEnd w:id="21"/>
-    <w:bookmarkStart w:id="22" w:name="Xd687b75b7bf4c33bb8b8cf19b934f140fc36570"/>
+    <w:bookmarkStart w:id="22" w:name="X87a523ef52c0383b54bb82d3ac304813dfd0457"/>
     <w:p>
       <w:pPr>
         <w:pStyle w:val="Heading3"/>
       </w:pPr>
       <w:r>
-        <w:t xml:space="preserve">4.2 Prosecution Demands Are Less Predictable Than Sentences (RQ2)</w:t>
+        <w:t xml:space="preserve">4.2 Discretion Enters Upstream: Judges Partially Correct Toward Case Facts (RQ2)</w:t>
       </w:r>
     </w:p>
     <w:p>
@@ -1529,23 +1831,20 @@
         <w:pStyle w:val="FirstParagraph"/>
       </w:pPr>
       <w:r>
-        <w:t xml:space="preserve">A model including state financial loss, charge type, and year explains only</w:t>
-      </w:r>
-      <w:r>
-        <w:t xml:space="preserve"> </w:t>
-      </w:r>
-      <w:r>
-        <w:rPr>
-          <w:b/>
-          <w:bCs/>
-        </w:rPr>
-        <w:t xml:space="preserve">31.5%</w:t>
-      </w:r>
-      <w:r>
-        <w:t xml:space="preserve"> </w:t>
-      </w:r>
-      <w:r>
-        <w:t xml:space="preserve">of variation in prosecution demands (R-squared=0.315). This is substantially lower than the 60% of sentencing variance explained by prosecution demand alone (Author, 2026b).</w:t>
+        <w:t xml:space="preserve">How predictable are prosecution demands from observable case features — and, critically, how does that compare with sentences</w:t>
+      </w:r>
+      <w:r>
+        <w:t xml:space="preserve"> </w:t>
+      </w:r>
+      <w:r>
+        <w:rPr>
+          <w:i/>
+          <w:iCs/>
+        </w:rPr>
+        <w:t xml:space="preserve">under the same specification</w:t>
+      </w:r>
+      <w:r>
+        <w:t xml:space="preserve">? Comparing the demand model against the sentence-from-demand benchmark alone would be misleading: the 64% of sentencing variance explained by the demand (Author, 2026b) measures how faithfully judges follow a procedural anchor, not how tightly sentences track case facts. The fair comparison holds the predictor set constant (cleaned sample, n=262):</w:t>
       </w:r>
     </w:p>
     <w:tbl>
@@ -1569,7 +1868,7 @@
               <w:pStyle w:val="Compact"/>
             </w:pPr>
             <w:r>
-              <w:t xml:space="preserve">Model</w:t>
+              <w:t xml:space="preserve">Model (identical predictors where comparable)</w:t>
             </w:r>
           </w:p>
         </w:tc>
@@ -1593,18 +1892,18 @@
               <w:pStyle w:val="Compact"/>
             </w:pPr>
             <w:r>
-              <w:t xml:space="preserve">tuntutan ~ log(kerugian)</w:t>
-            </w:r>
-          </w:p>
-        </w:tc>
-        <w:tc>
-          <w:tcPr/>
-          <w:p>
-            <w:pPr>
-              <w:pStyle w:val="Compact"/>
-            </w:pPr>
-            <w:r>
-              <w:t xml:space="preserve">0.297</w:t>
+              <w:t xml:space="preserve">tuntutan ~ log(kerugian) + Pasal 2 + Pasal 3 + year</w:t>
+            </w:r>
+          </w:p>
+        </w:tc>
+        <w:tc>
+          <w:tcPr/>
+          <w:p>
+            <w:pPr>
+              <w:pStyle w:val="Compact"/>
+            </w:pPr>
+            <w:r>
+              <w:t xml:space="preserve">0.405</w:t>
             </w:r>
           </w:p>
         </w:tc>
@@ -1617,18 +1916,18 @@
               <w:pStyle w:val="Compact"/>
             </w:pPr>
             <w:r>
-              <w:t xml:space="preserve">tuntutan ~ log(kerugian) + Pasal 2 + Pasal 3</w:t>
-            </w:r>
-          </w:p>
-        </w:tc>
-        <w:tc>
-          <w:tcPr/>
-          <w:p>
-            <w:pPr>
-              <w:pStyle w:val="Compact"/>
-            </w:pPr>
-            <w:r>
-              <w:t xml:space="preserve">0.315</w:t>
+              <w:t xml:space="preserve">vonis ~ log(kerugian) + Pasal 2 + Pasal 3 + year</w:t>
+            </w:r>
+          </w:p>
+        </w:tc>
+        <w:tc>
+          <w:tcPr/>
+          <w:p>
+            <w:pPr>
+              <w:pStyle w:val="Compact"/>
+            </w:pPr>
+            <w:r>
+              <w:t xml:space="preserve">0.498</w:t>
             </w:r>
           </w:p>
         </w:tc>
@@ -1641,42 +1940,18 @@
               <w:pStyle w:val="Compact"/>
             </w:pPr>
             <w:r>
-              <w:t xml:space="preserve">tuntutan ~ log(kerugian) + Pasal 2 + Pasal 3 + year</w:t>
-            </w:r>
-          </w:p>
-        </w:tc>
-        <w:tc>
-          <w:tcPr/>
-          <w:p>
-            <w:pPr>
-              <w:pStyle w:val="Compact"/>
-            </w:pPr>
-            <w:r>
-              <w:t xml:space="preserve">0.321</w:t>
-            </w:r>
-          </w:p>
-        </w:tc>
-      </w:tr>
-      <w:tr>
-        <w:tc>
-          <w:tcPr/>
-          <w:p>
-            <w:pPr>
-              <w:pStyle w:val="Compact"/>
-            </w:pPr>
-            <w:r>
-              <w:t xml:space="preserve">vonis ~ tuntutan (Paper 2 benchmark)</w:t>
-            </w:r>
-          </w:p>
-        </w:tc>
-        <w:tc>
-          <w:tcPr/>
-          <w:p>
-            <w:pPr>
-              <w:pStyle w:val="Compact"/>
-            </w:pPr>
-            <w:r>
-              <w:t xml:space="preserve">0.600</w:t>
+              <w:t xml:space="preserve">vonis ~ tuntutan (anchor model; Author, 2026b)</w:t>
+            </w:r>
+          </w:p>
+        </w:tc>
+        <w:tc>
+          <w:tcPr/>
+          <w:p>
+            <w:pPr>
+              <w:pStyle w:val="Compact"/>
+            </w:pPr>
+            <w:r>
+              <w:t xml:space="preserve">0.642</w:t>
             </w:r>
           </w:p>
         </w:tc>
@@ -1687,15 +1962,60 @@
         <w:pStyle w:val="BodyText"/>
       </w:pPr>
       <w:r>
-        <w:t xml:space="preserve">Adding charge type improves the model marginally: Pasal 2 cases receive demands 1.1 years higher than equivalent cases (p=0.019). Pasal 3 is not independently significant (p=0.109). Year adds no significant explanatory power (p=0.113).</w:t>
-      </w:r>
-    </w:p>
-    <w:p>
-      <w:pPr>
-        <w:pStyle w:val="BodyText"/>
-      </w:pPr>
-      <w:r>
-        <w:t xml:space="preserve">Put differently: judges are well-anchored to what prosecutors ask for (R-squared=0.60), but prosecutors themselves are only loosely tethered to the objective severity of the case. The discretion gap lies upstream.</w:t>
+        <w:t xml:space="preserve">Conditional on observable case facts, sentences are</w:t>
+      </w:r>
+      <w:r>
+        <w:t xml:space="preserve"> </w:t>
+      </w:r>
+      <w:r>
+        <w:rPr>
+          <w:i/>
+          <w:iCs/>
+        </w:rPr>
+        <w:t xml:space="preserve">more</w:t>
+      </w:r>
+      <w:r>
+        <w:t xml:space="preserve"> </w:t>
+      </w:r>
+      <w:r>
+        <w:t xml:space="preserve">predictable than demands (R-squared 0.498 vs 0.405), not equally so. Conditional on the demand, sentences are highly predictable (R-squared 0.642). The pattern admits one coherent reading:</w:t>
+      </w:r>
+      <w:r>
+        <w:t xml:space="preserve"> </w:t>
+      </w:r>
+      <w:r>
+        <w:rPr>
+          <w:b/>
+          <w:bCs/>
+        </w:rPr>
+        <w:t xml:space="preserve">discretion enters the system once — at the demand stage — but judges do not merely transmit it</w:t>
+      </w:r>
+      <w:r>
+        <w:t xml:space="preserve">. They pull sentences modestly toward case facts, leaving sentences somewhat better tethered to the record than the demands they anchor to. This is partial correction, not pure propagation, and it is consistent with the bidirectional anchoring correction documented for judges in companion work (Author, 2026c). The same direction appears in the elasticities: the sentence-loss elasticity (0.145, SE 0.011) modestly exceeds the demand-loss elasticity (0.124, SE 0.012) — judges weight loss slightly more than prosecutors do — though the two are not statistically distinguishable. The proportionality failure documented in Section 4.1 therefore passes through judicial sentencing</w:t>
+      </w:r>
+      <w:r>
+        <w:t xml:space="preserve"> </w:t>
+      </w:r>
+      <w:r>
+        <w:rPr>
+          <w:i/>
+          <w:iCs/>
+        </w:rPr>
+        <w:t xml:space="preserve">damped</w:t>
+      </w:r>
+      <w:r>
+        <w:t xml:space="preserve"> </w:t>
+      </w:r>
+      <w:r>
+        <w:t xml:space="preserve">rather than amplified: judges blunt it, but they do not close it.</w:t>
+      </w:r>
+    </w:p>
+    <w:p>
+      <w:pPr>
+        <w:pStyle w:val="BodyText"/>
+      </w:pPr>
+      <w:r>
+        <w:t xml:space="preserve">Within the demand model, charge type contributes modestly: Pasal 2 cases receive demands about 0.9 years higher (p=0.062), Pasal 3 cases about 0.5 years lower (p=0.295), and year adds borderline explanatory power (b=+0.11, p=0.085). Loss magnitude, even where significant, leaves the majority of demand variation unexplained.</w:t>
       </w:r>
     </w:p>
     <w:bookmarkEnd w:id="22"/>
@@ -1713,15 +2033,15 @@
         <w:pStyle w:val="FirstParagraph"/>
       </w:pPr>
       <w:r>
-        <w:t xml:space="preserve">Prosecution demands have increased significantly over the observation period (Spearman rho=0.773, p=0.005), from approximately 5 years in 2014-2015 to approximately 7.5 years in 2025-2026. However, the sentencing discount (vonis/tuntutan) has not changed (Spearman rho=0.145, p=0.670), indicating that judges absorb the increased demands proportionally rather than resisting the upward trend.</w:t>
-      </w:r>
-    </w:p>
-    <w:p>
-      <w:pPr>
-        <w:pStyle w:val="BodyText"/>
-      </w:pPr>
-      <w:r>
-        <w:t xml:space="preserve">One reading: as anti-corruption rhetoric has intensified, prosecutors have raised their demands — but judges keep cutting by the same fraction, so the actual sentences have risen more slowly than the demands.</w:t>
+        <w:t xml:space="preserve">Prosecution demands have increased significantly over the observation period (Spearman rho=0.228, p&lt;0.001 at the case level), from approximately 4.5 years in 2014-2015 to approximately 7.5 years in 2025-2026. Over the same period the sentencing discount (vonis/tuntutan) has widened modestly (Spearman rho=−0.143, p=0.021): sentences have not fully kept pace with the rising demands, so the typical gap between demand and sentence has grown rather than holding steady.</w:t>
+      </w:r>
+    </w:p>
+    <w:p>
+      <w:pPr>
+        <w:pStyle w:val="BodyText"/>
+      </w:pPr>
+      <w:r>
+        <w:t xml:space="preserve">One reading: as anti-corruption rhetoric has intensified, prosecutors have raised their demands — and judges have let the discount widen rather than fully absorbing the increase, so actual sentences have risen more slowly still.</w:t>
       </w:r>
     </w:p>
     <w:bookmarkEnd w:id="23"/>
@@ -1739,15 +2059,15 @@
         <w:pStyle w:val="FirstParagraph"/>
       </w:pPr>
       <w:r>
-        <w:t xml:space="preserve">Raw prosecution demands vary significantly across provinces (Kruskal-Wallis H=40.0, p&lt;0.001). However, after controlling for state financial loss, the geographic variation disappears (H=22.2, p=0.104). Regions with higher average demands (DKI Jakarta, Sumatera Selatan) handle larger-magnitude cases, not systematically harsher prosecutors.</w:t>
-      </w:r>
-    </w:p>
-    <w:p>
-      <w:pPr>
-        <w:pStyle w:val="BodyText"/>
-      </w:pPr>
-      <w:r>
-        <w:t xml:space="preserve">The same result appears in judicial sentencing (Author, 2026b): what looks like regional disparity is really case mix. Prosecutors in different regions are not systematically harsher or softer — they handle different kinds of cases.</w:t>
+        <w:t xml:space="preserve">Raw prosecution demands vary significantly across provinces (Kruskal-Wallis H=57.2, p&lt;0.001 among the 15 provinces with at least five cases). After controlling for state financial loss, most of this variation is absorbed, but a residual geographic signal persists (H=24.8, p=0.036): regions are not interchangeable, though case magnitude explains the bulk of the raw differences. Regions with higher average demands (DKI Jakarta, Sumatera Selatan) handle larger-magnitude cases; what remains after controlling for magnitude is comparatively small.</w:t>
+      </w:r>
+    </w:p>
+    <w:p>
+      <w:pPr>
+        <w:pStyle w:val="BodyText"/>
+      </w:pPr>
+      <w:r>
+        <w:t xml:space="preserve">The same largely-compositional pattern appears in judicial sentencing (Author, 2026b): most of what looks like regional disparity is case mix rather than systematically harsher or softer local prosecutors.</w:t>
       </w:r>
     </w:p>
     <w:bookmarkEnd w:id="24"/>
@@ -1775,7 +2095,7 @@
         <w:pStyle w:val="FirstParagraph"/>
       </w:pPr>
       <w:r>
-        <w:t xml:space="preserve">An obvious objection is that state financial loss is only one dimension of crime severity. Prosecutors legitimately consider the defendant’s position, cooperation, modus operandi, and restitution when calibrating demands. A low elasticity with respect to kerugian alone does not necessarily indicate broken proportionality if other factors compensate. We address this in two ways. First, controlling for the available multi-dimensional indicators — charge type (Pasal 2 vs 3), restitution mentions, and region — does not change the elasticity. Second, even granting that severity is multi-dimensional, an elasticity of 0.126 is extreme relative to the comparative benchmark: it implies that a case involving ten thousand times more public harm receives only about three times the punishment demand, roughly half the graduation built into the US loss table. No plausible weighting of non-monetary severity factors can close a gap this large — and such factors would have to be</w:t>
+        <w:t xml:space="preserve">An obvious objection is that state financial loss is only one dimension of crime severity. Prosecutors legitimately consider the defendant’s position, cooperation, modus operandi, and restitution when calibrating demands. A low elasticity with respect to kerugian alone does not necessarily indicate broken proportionality if other factors compensate. We address this in two ways. First, controlling for the available multi-dimensional indicators — charge type (Pasal 2 vs 3), restitution mentions, and region — does not change the elasticity. Second, even granting that severity is multi-dimensional, an elasticity of 0.124 is extreme relative to the comparative benchmark: it implies that a case involving ten thousand times more public harm receives only about three times the punishment demand, roughly half the graduation built into the US loss table. No plausible weighting of non-monetary severity factors can close a gap this large — and such factors would have to be</w:t>
       </w:r>
       <w:r>
         <w:t xml:space="preserve"> </w:t>
@@ -1883,7 +2203,7 @@
         <w:pStyle w:val="FirstParagraph"/>
       </w:pPr>
       <w:r>
-        <w:t xml:space="preserve">If the expected additional punishment for increasing the scale of corruption from Rp 10 million to Rp 100 billion is only 6.3 years, the marginal cost of additional corruption is approximately Rp 16 billion per year of additional imprisonment. For a rational actor, this makes larger-scale corruption overwhelmingly favorable: the</w:t>
+        <w:t xml:space="preserve">If the expected additional punishment for increasing the scale of corruption from Rp 10 million to Rp 100 billion is only 5.8 years, the marginal cost of additional corruption is approximately Rp 17 billion per year of additional imprisonment. For a rational actor, this makes larger-scale corruption overwhelmingly favorable: the</w:t>
       </w:r>
       <w:r>
         <w:t xml:space="preserve"> </w:t>
@@ -1921,7 +2241,39 @@
         <w:pStyle w:val="FirstParagraph"/>
       </w:pPr>
       <w:r>
-        <w:t xml:space="preserve">Our finding that prosecution demands are less predictable than sentences (R-squared=0.315 vs 0.600) shifts the focus of the proportionality problem upstream. The</w:t>
+        <w:t xml:space="preserve">Our finding that discretion enters the system once, at the demand stage (Section 4.2), shifts the focus of the proportionality problem upstream. Sentences are in fact somewhat</w:t>
+      </w:r>
+      <w:r>
+        <w:t xml:space="preserve"> </w:t>
+      </w:r>
+      <w:r>
+        <w:rPr>
+          <w:i/>
+          <w:iCs/>
+        </w:rPr>
+        <w:t xml:space="preserve">better</w:t>
+      </w:r>
+      <w:r>
+        <w:t xml:space="preserve"> </w:t>
+      </w:r>
+      <w:r>
+        <w:t xml:space="preserve">tethered to case facts than demands are (R-squared 0.498 vs 0.405 under identical specifications); what makes sentences</w:t>
+      </w:r>
+      <w:r>
+        <w:t xml:space="preserve"> </w:t>
+      </w:r>
+      <w:r>
+        <w:rPr>
+          <w:i/>
+          <w:iCs/>
+        </w:rPr>
+        <w:t xml:space="preserve">look</w:t>
+      </w:r>
+      <w:r>
+        <w:t xml:space="preserve"> </w:t>
+      </w:r>
+      <w:r>
+        <w:t xml:space="preserve">orderly is still their faithful anchoring to the demand (R-squared=0.64). The</w:t>
       </w:r>
       <w:r>
         <w:t xml:space="preserve"> </w:t>
@@ -1933,15 +2285,31 @@
         <w:t xml:space="preserve"> </w:t>
       </w:r>
       <w:r>
-        <w:t xml:space="preserve">identified in Author (2026b) — where 40% of sentencing variance is unexplained — may be partially inherited from prosecutorial opacity. Judges are anchored to demands that are themselves not proportional to case severity.</w:t>
-      </w:r>
-    </w:p>
-    <w:p>
-      <w:pPr>
-        <w:pStyle w:val="BodyText"/>
-      </w:pPr>
-      <w:r>
-        <w:t xml:space="preserve">Cross-national comparisons support this interpretation. Our sentence-from-demand R-squared of 0.60 matches the Dutch sentencing benchmark (van Wingerden et al., 2016, R-squared=0.60 with multiple predictors) and exceeds the majority of 28 sentencing regression studies reviewed by Wittenbrink and Niehaus (2022). The approximately 40% unexplained sentencing variance is thus not a distinctively Indonesian phenomenon — it is consistent with judicial discretion levels observed globally.</w:t>
+        <w:t xml:space="preserve">identified in Author (2026b) is thus partly</w:t>
+      </w:r>
+      <w:r>
+        <w:t xml:space="preserve"> </w:t>
+      </w:r>
+      <w:r>
+        <w:rPr>
+          <w:i/>
+          <w:iCs/>
+        </w:rPr>
+        <w:t xml:space="preserve">inherited</w:t>
+      </w:r>
+      <w:r>
+        <w:t xml:space="preserve"> </w:t>
+      </w:r>
+      <w:r>
+        <w:t xml:space="preserve">from prosecutorial opacity — judges anchor to demands that are themselves not proportional to case severity — but only partly: by pulling sentences toward the facts, judges absorb some of the demand’s noise rather than transmitting it wholesale.</w:t>
+      </w:r>
+    </w:p>
+    <w:p>
+      <w:pPr>
+        <w:pStyle w:val="BodyText"/>
+      </w:pPr>
+      <w:r>
+        <w:t xml:space="preserve">Cross-national comparisons support this interpretation. Our sentence-from-demand R-squared of 0.64 is close to the Dutch sentencing benchmark (van Wingerden et al., 2016, R-squared=0.60 with multiple predictors) and exceeds the majority of 28 sentencing regression studies reviewed by Wittenbrink and Niehaus (2022). The roughly 36% of sentencing variance left unexplained is thus not a distinctively Indonesian phenomenon — it is consistent with judicial discretion levels observed globally.</w:t>
       </w:r>
     </w:p>
     <w:p>
@@ -1965,7 +2333,7 @@
         <w:t xml:space="preserve"> </w:t>
       </w:r>
       <w:r>
-        <w:t xml:space="preserve">of compression at the prosecutorial stage. The demand-loss elasticity of 0.126 is roughly half the about 0.25–0.30 implied by the US loss table — the most explicitly loss-graduated regime in comparative practice — yet Indonesia reaches this compression with no sentencing or charging guidelines at all. Where the US graduates punishment by loss through a deliberate, contested, and now-reforming 16-tier schedule (United States Sentencing Commission, 2024, 2025), Indonesian prosecutors compress the vast range of corruption severity into a narrow demand band as an unstructured by-product of discretion. That band then propagates through the faithfully anchored judicial system, so a reform aimed only at judges would leave the binding constraint untouched.</w:t>
+        <w:t xml:space="preserve">of compression at the prosecutorial stage. The demand-loss elasticity of 0.124 is well under half the gradient US federal courts actually deliver (realized elasticity ≈0.29; Section 2.1) — and the US is the most explicitly loss-graduated regime in comparative practice — yet Indonesia reaches this compression with no sentencing or charging guidelines at all. Where the US graduates punishment by loss through a deliberate, contested, and now-reforming 16-tier schedule (United States Sentencing Commission, 2024, 2025), Indonesian prosecutors compress the vast range of corruption severity into a narrow demand band as an unstructured by-product of discretion. That band then propagates through the judicial system — damped but not closed by judges — so a reform aimed only at judges would leave the binding constraint largely untouched.</w:t>
       </w:r>
     </w:p>
     <w:bookmarkEnd w:id="28"/>
@@ -2057,7 +2425,7 @@
         <w:t xml:space="preserve"> </w:t>
       </w:r>
       <w:r>
-        <w:t xml:space="preserve">Our corpus consists of Supreme Court cassation decisions — appealed cases. The demand-loss elasticity may differ at the district court level, where the full population of corruption cases is processed. If cases with extreme disproportionality are more likely to be appealed, our estimates may not generalize.</w:t>
+        <w:t xml:space="preserve">Our corpus consists of Supreme Court cassation decisions — appealed cases. The demand-loss elasticity may differ at the district court level, where the full population of corruption cases is processed. If the probability of cassation is itself correlated with both loss magnitude and demand severity (plausible in both directions: prosecutors appeal lenient outcomes, defendants appeal harsh ones), conditioning on cassation can distort the estimated elasticity in a direction that cannot be signed a priori. Replication on first-instance (PN Tipikor) verdicts is the identification fix and is planned as follow-up work. A second selection margin operates within the corpus: the estimation sample comprises only cases with a documented state-loss figure (n=262), which are predominantly embezzlement- and procurement-type cases; bribery and gratification cases typically lack a kerugian figure. In our corpus the documented-loss cases carry only marginally higher sentences than the rest (5.3 vs 4.7 years, Mann-Whitney p=0.053), so the sample is not strongly selected on severity — but the elasticity still characterizes corruption with quantified fiscal harm, not all corruption. A residual domain-classification concern remains: a small number of cases scraped into the corruption directory are substantively other matters (for example a Plantation Law case rather than a corruption offence); these are few and we exclude them where detected, but we cannot guarantee a perfectly clean denominator, and we deliberately did not remove individual cases post hoc from the estimation sample to avoid outcome-dependent manipulation.</w:t>
       </w:r>
     </w:p>
     <w:p>
@@ -2075,7 +2443,20 @@
         <w:t xml:space="preserve"> </w:t>
       </w:r>
       <w:r>
-        <w:t xml:space="preserve">State financial loss figures are extracted from verdict metadata and may not reflect the actual harm. Loss quantification in corruption cases is contested and sometimes reflects prosecutorial framing rather than objective measurement.</w:t>
+        <w:t xml:space="preserve">State financial loss figures are extracted from verdict text and may not reflect the actual harm. Loss quantification in corruption cases is contested — BPK, BPKP, and prosecution estimates can differ, and some figures bundle contested components (the PT Timah mega-case: the BPKP audit cited approximately Rp 300 trillion, but roughly Rp 271 trillion of that is environmental damage the Supreme Court excluded from the state-financial-loss basis, on which it fixed Rp 28.9 trillion; we use 28.9 trillion and treat 300 trillion as an alternative specification). Classical measurement error in log-loss would attenuate the estimated elasticity toward zero, so part of the measured compression could in principle be an errors-in-variables artifact. Two considerations bound this concern. First, because documented losses span more than seven orders of magnitude, the variance of true log-loss is large, so the attenuation factor var(true)/var(observed) remains high unless errors are themselves of order-of-magnitude scale: an error standard deviation of 0.5 log10 units (a factor-of-3 misstatement) would attenuate the elasticity by roughly 10%, far too little to explain the gap between 0.124 and any benchmark near 0.25. Second, the robustness checks in Section 4.1 — dropping the most contested mega-case observations — move the estimate</w:t>
+      </w:r>
+      <w:r>
+        <w:t xml:space="preserve"> </w:t>
+      </w:r>
+      <w:r>
+        <w:rPr>
+          <w:i/>
+          <w:iCs/>
+        </w:rPr>
+        <w:t xml:space="preserve">upward</w:t>
+      </w:r>
+      <w:r>
+        <w:t xml:space="preserve">, the opposite of what error-driven compression at the tails would produce. A related extraction concern bears on the demand–sentence predictability gap of Section 4.2: as the extraction pipeline was refined over successive validation rounds, the measured gap between demand and sentence predictability narrowed, indicating that part of the apparent excess unpredictability of demands was extraction noise rather than prosecutorial discretion. The gap does not vanish at the current extraction quality, but its magnitude should be read as sensitive to measurement. Measurement error plausibly shaves both estimates at the margin; it cannot manufacture the central finding.</w:t>
       </w:r>
     </w:p>
     <w:p>
@@ -2093,7 +2474,7 @@
         <w:t xml:space="preserve"> </w:t>
       </w:r>
       <w:r>
-        <w:t xml:space="preserve">Variables not captured in our data — defendant cooperation, plea agreements, strength of evidence, defendant status, case complexity — may explain some of the demand variation we attribute to prosecutorial discretion. However, even if these confounders partially explain the low elasticity, the finding that R²=0.285 for the loss-demand relationship remains consequential: loss magnitude is a weak predictor of prosecution demand regardless of mechanism.</w:t>
+        <w:t xml:space="preserve">Variables not captured in our data — defendant cooperation, plea agreements, strength of evidence, defendant status, case complexity — may explain some of the demand variation we attribute to prosecutorial discretion. However, even if these confounders partially explain the low elasticity, the finding that R²=0.300 for the loss-demand relationship remains consequential: loss magnitude is a weak predictor of prosecution demand regardless of mechanism.</w:t>
       </w:r>
     </w:p>
     <w:p>
@@ -2111,7 +2492,7 @@
         <w:t xml:space="preserve"> </w:t>
       </w:r>
       <w:r>
-        <w:t xml:space="preserve">Our tuntutan variable may refer to the original district court demand or to the prosecution’s position at cassation. Two observations suggest it is the original demand. First, the mean sentencing discount (vonis/tuntutan = 0.78) implies judges consistently reduce demands by ~22% — a pattern consistent with PN-level demands being discounted, not with cassation-level demands that would have been adjusted to approximate the expected outcome. Second, in 75% of cases vonis falls below tuntutan, inconsistent with cassation-level demands that would more closely track the eventual sentence. Nevertheless, we cannot rule out that some tuntutan values reflect cassation-stage adjustments, which would compress the demand range and bias our elasticity estimate downward.</w:t>
+        <w:t xml:space="preserve">Our tuntutan variable may refer to the original district court demand or to the prosecution’s position at cassation. Two observations suggest it is the original demand. First, the median sentencing discount (vonis/tuntutan = 0.75) implies judges consistently reduce demands by about a quarter — a pattern consistent with PN-level demands being discounted, not with cassation-level demands that would have been adjusted to approximate the expected outcome. Second, in 74% of cases vonis falls below tuntutan, inconsistent with cassation-level demands that would more closely track the eventual sentence. Nevertheless, we cannot rule out that some tuntutan values reflect cassation-stage adjustments, which would compress the demand range and bias our elasticity estimate downward.</w:t>
       </w:r>
     </w:p>
     <w:bookmarkEnd w:id="30"/>
@@ -2130,7 +2511,7 @@
         <w:pStyle w:val="FirstParagraph"/>
       </w:pPr>
       <w:r>
-        <w:t xml:space="preserve">We document a striking failure of proportionality in Indonesian corruption prosecution: the elasticity of prosecution demand with respect to state financial loss is only 0.126, meaning that a 10,000-fold increase in corruption scale produces only a 3.2-fold increase in the prosecution demand. Because punishment is bounded, some compression is inevitable; but Indonesia’s elasticity is roughly half that of the explicitly loss-graduated US sentencing system and is achieved without any guideline structure. This inelasticity is not explained by statutory caps, geographic variation, or charge type.</w:t>
+        <w:t xml:space="preserve">We document a striking failure of proportionality in Indonesian corruption prosecution: the elasticity of prosecution demand with respect to state financial loss is only 0.124, meaning that a 10,000-fold increase in corruption scale produces only a 3.1-fold increase in the prosecution demand. Because punishment is bounded, some compression is inevitable; but Indonesia’s elasticity is about 43% of the loss-severity gradient the US system delivers in realized practice (≈0.29) and is achieved without any guideline structure. This inelasticity is not explained by statutory caps or charge type, and only weakly by geography.</w:t>
       </w:r>
     </w:p>
     <w:p>
@@ -2158,7 +2539,7 @@
         <w:pStyle w:val="BodyText"/>
       </w:pPr>
       <w:r>
-        <w:t xml:space="preserve">Our findings shift the focus of corruption sentencing reform from judges to prosecutors. Judicial sentencing in Indonesia is well-anchored to prosecution demands (R-squared=0.60, consistent with cross-national benchmarks). The proportionality failure originates upstream, in prosecutorial demand-setting, where only 31.5% of variation can be explained by available case features. Restoring proportionality requires addressing prosecutorial discretion — through guidelines, transparency requirements, or graduated demand structures — not merely reforming judicial sentencing.</w:t>
+        <w:t xml:space="preserve">Our findings shift the focus of corruption sentencing reform from judges to prosecutors. Judicial sentencing in Indonesia is well-anchored to prosecution demands (R-squared=0.64, consistent with cross-national benchmarks), and under identical case-fact specifications sentences are in fact somewhat better explained than demands (R-squared 0.498 vs 0.405) — discretion enters the system once, at the demand stage, and is damped but not closed by judges (sentence-loss elasticity 0.145 vs demand-loss elasticity 0.124). Restoring proportionality requires addressing prosecutorial discretion — through guidelines, transparency requirements, or graduated demand structures — not merely reforming judicial sentencing.</w:t>
       </w:r>
     </w:p>
     <w:p>
@@ -2361,6 +2742,27 @@
         <w:pStyle w:val="BodyText"/>
       </w:pPr>
       <w:r>
+        <w:t xml:space="preserve">Bennett, M. W., Levinson, J. D., &amp; Hioki, K. (2017). Judging Federal White-Collar Fraud Sentencing: An Empirical Study Revealing the Need for Further Reform.</w:t>
+      </w:r>
+      <w:r>
+        <w:t xml:space="preserve"> </w:t>
+      </w:r>
+      <w:r>
+        <w:rPr>
+          <w:i/>
+          <w:iCs/>
+        </w:rPr>
+        <w:t xml:space="preserve">Iowa Law Review</w:t>
+      </w:r>
+      <w:r>
+        <w:t xml:space="preserve">, 102, 939-1000.</w:t>
+      </w:r>
+    </w:p>
+    <w:p>
+      <w:pPr>
+        <w:pStyle w:val="BodyText"/>
+      </w:pPr>
+      <w:r>
         <w:t xml:space="preserve">Bibas, S. (2004). Plea Bargaining outside the Shadow of Trial.</w:t>
       </w:r>
       <w:r>
@@ -2424,6 +2826,27 @@
         <w:pStyle w:val="BodyText"/>
       </w:pPr>
       <w:r>
+        <w:t xml:space="preserve">Hewitt, J. (2016). Fifty Shades of Gray: Sentencing Trends in Major White-Collar Cases.</w:t>
+      </w:r>
+      <w:r>
+        <w:t xml:space="preserve"> </w:t>
+      </w:r>
+      <w:r>
+        <w:rPr>
+          <w:i/>
+          <w:iCs/>
+        </w:rPr>
+        <w:t xml:space="preserve">Yale Law Journal</w:t>
+      </w:r>
+      <w:r>
+        <w:t xml:space="preserve">, 125(4), 1018-1071.</w:t>
+      </w:r>
+    </w:p>
+    <w:p>
+      <w:pPr>
+        <w:pStyle w:val="BodyText"/>
+      </w:pPr>
+      <w:r>
         <w:t xml:space="preserve">Indonesia Corruption Watch (2025). Sentencing trend monitoring report 2024. Jakarta: ICW.</w:t>
       </w:r>
     </w:p>
@@ -2530,6 +2953,27 @@
       </w:r>
       <w:r>
         <w:t xml:space="preserve">, 29(1), 1-40.</w:t>
+      </w:r>
+    </w:p>
+    <w:p>
+      <w:pPr>
+        <w:pStyle w:val="BodyText"/>
+      </w:pPr>
+      <w:r>
+        <w:t xml:space="preserve">United States Sentencing Commission (2013).</w:t>
+      </w:r>
+      <w:r>
+        <w:t xml:space="preserve"> </w:t>
+      </w:r>
+      <w:r>
+        <w:rPr>
+          <w:i/>
+          <w:iCs/>
+        </w:rPr>
+        <w:t xml:space="preserve">Sentencing and Guideline Application Information for §2B1.1 Offenders</w:t>
+      </w:r>
+      <w:r>
+        <w:t xml:space="preserve">. Symposium on Economic Crime. Washington, DC: USSC. https://www.ussc.gov/sites/default/files/pdf/research-and-publications/research-projects-and-surveys/economic-crimes/20130918-19-symposium/Sentencing_Guideline_Application_Info.pdf</w:t>
       </w:r>
     </w:p>
     <w:p>

</xml_diff>

<commit_message>
Paper 4: G3+G5 HIJAU (11 Agt) — Go Frendi ditambahkan co-author; semua gate hijau, SIAP SUBMIT ke AJC
- Co-author Go Frendi Gunawan (State Alchemists): title page, Author contributions, cover letter (I->We)
- De-anonimisasi placeholder 'Author (2026a/b/c)' -> 'Amien'; referensi 2026b dikoreksi ([under review] basi -> SSRN 6574140)
- DOCX/PDF rebuilt (pandoc xelatex Times New Roman), glyph ≈²–§ terverifikasi
- D30 di DECISIONS.md; GATES.md G3+G5 HIJAU
</commit_message>
<xml_diff>
--- a/reports/paper4_draft.docx
+++ b/reports/paper4_draft.docx
@@ -11,6 +11,66 @@
         <w:t xml:space="preserve">Broken Proportionality: Prosecutorial Demands and State Financial Loss in Indonesian Corruption Cases</w:t>
       </w:r>
     </w:p>
+    <w:p>
+      <w:pPr>
+        <w:pStyle w:val="FirstParagraph"/>
+      </w:pPr>
+      <w:r>
+        <w:rPr>
+          <w:b/>
+          <w:bCs/>
+        </w:rPr>
+        <w:t xml:space="preserve">Mukhlis Amien</w:t>
+      </w:r>
+      <w:r>
+        <w:t xml:space="preserve">1</w:t>
+      </w:r>
+      <w:r>
+        <w:t xml:space="preserve"> </w:t>
+      </w:r>
+      <w:r>
+        <w:t xml:space="preserve">·</w:t>
+      </w:r>
+      <w:r>
+        <w:t xml:space="preserve"> </w:t>
+      </w:r>
+      <w:r>
+        <w:rPr>
+          <w:b/>
+          <w:bCs/>
+        </w:rPr>
+        <w:t xml:space="preserve">Go Frendi Gunawan</w:t>
+      </w:r>
+      <w:r>
+        <w:t xml:space="preserve">2</w:t>
+      </w:r>
+    </w:p>
+    <w:p>
+      <w:pPr>
+        <w:pStyle w:val="BodyText"/>
+      </w:pPr>
+      <w:r>
+        <w:t xml:space="preserve">1</w:t>
+      </w:r>
+      <w:r>
+        <w:t xml:space="preserve"> </w:t>
+      </w:r>
+      <w:r>
+        <w:t xml:space="preserve">Department of Informatics, Universitas Bhinneka Nusantara, Malang, Indonesia — amien@ubhinus.ac.id</w:t>
+      </w:r>
+      <w:r>
+        <w:t xml:space="preserve"> </w:t>
+      </w:r>
+      <w:r>
+        <w:t xml:space="preserve">2</w:t>
+      </w:r>
+      <w:r>
+        <w:t xml:space="preserve"> </w:t>
+      </w:r>
+      <w:r>
+        <w:t xml:space="preserve">State Alchemists</w:t>
+      </w:r>
+    </w:p>
     <w:bookmarkStart w:id="9" w:name="abstract"/>
     <w:p>
       <w:pPr>
@@ -125,7 +185,7 @@
         <w:pStyle w:val="BodyText"/>
       </w:pPr>
       <w:r>
-        <w:t xml:space="preserve">Sentencing research overwhelmingly studies judges, treating prosecution demands as a given (Author, 2026b; Medvedeva et al., 2020; Strickson &amp; De La Iglesia, 2020). This is a blind spot. Prosecution demands set the anchor from which judges work: in Indonesian corruption cases, prosecution demand alone explains about 64% of sentencing variance (Author, 2026b). If the anchor itself is not proportional to the crime, judicial proportionality is impossible regardless of how carefully judges deliberate.</w:t>
+        <w:t xml:space="preserve">Sentencing research overwhelmingly studies judges, treating prosecution demands as a given (Amien, 2026b; Medvedeva et al., 2020; Strickson &amp; De La Iglesia, 2020). This is a blind spot. Prosecution demands set the anchor from which judges work: in Indonesian corruption cases, prosecution demand alone explains about 64% of sentencing variance (Amien, 2026b). If the anchor itself is not proportional to the crime, judicial proportionality is impossible regardless of how carefully judges deliberate.</w:t>
       </w:r>
     </w:p>
     <w:p>
@@ -448,7 +508,7 @@
         <w:pStyle w:val="BodyText"/>
       </w:pPr>
       <w:r>
-        <w:t xml:space="preserve">In a companion study (Author, 2026c), we documented bidirectional anchoring correction in judicial sentencing: judges pull extreme prosecution demands toward an implicit norm. The present study tests whether a parallel phenomenon exists on the prosecutorial side: do prosecutors compress their demands toward a central range regardless of case severity?</w:t>
+        <w:t xml:space="preserve">In a companion study (Amien, 2026c), we documented bidirectional anchoring correction in judicial sentencing: judges pull extreme prosecution demands toward an implicit norm. The present study tests whether a parallel phenomenon exists on the prosecutorial side: do prosecutors compress their demands toward a central range regardless of case severity?</w:t>
       </w:r>
     </w:p>
     <w:bookmarkEnd w:id="14"/>
@@ -494,7 +554,7 @@
         <w:pStyle w:val="FirstParagraph"/>
       </w:pPr>
       <w:r>
-        <w:t xml:space="preserve">We use CorpusKorupsi (Author, 2026a), a structured dataset of Indonesian Supreme Court corruption verdicts. Of 693 scraped verdicts, 465 are confirmed corruption (tipikor) cases by document-text audit rather than directory label (the scraping directory is global and admits non-corruption matters; we verify each verdict’s substantive category). Of these, 265 carry a valid prosecution demand (</w:t>
+        <w:t xml:space="preserve">We use CorpusKorupsi (Amien, 2026a), a structured dataset of Indonesian Supreme Court corruption verdicts. Of 693 scraped verdicts, 465 are confirmed corruption (tipikor) cases by document-text audit rather than directory label (the scraping directory is global and admits non-corruption matters; we verify each verdict’s substantive category). Of these, 265 carry a valid prosecution demand (</w:t>
       </w:r>
       <w:r>
         <w:rPr>
@@ -1202,7 +1262,7 @@
         <w:t xml:space="preserve"> </w:t>
       </w:r>
       <w:r>
-        <w:t xml:space="preserve">We model prosecution demand using OLS regression with state financial loss, charge type (Pasal 2, Pasal 3), and year as predictors. We compare the R-squared with the demand-sentence relationship (R-squared = 0.64 from Author, 2026b) to assess relative predictability.</w:t>
+        <w:t xml:space="preserve">We model prosecution demand using OLS regression with state financial loss, charge type (Pasal 2, Pasal 3), and year as predictors. We compare the R-squared with the demand-sentence relationship (R-squared = 0.64 from Amien, 2026b) to assess relative predictability.</w:t>
       </w:r>
     </w:p>
     <w:p>
@@ -1844,7 +1904,7 @@
         <w:t xml:space="preserve">under the same specification</w:t>
       </w:r>
       <w:r>
-        <w:t xml:space="preserve">? Comparing the demand model against the sentence-from-demand benchmark alone would be misleading: the 64% of sentencing variance explained by the demand (Author, 2026b) measures how faithfully judges follow a procedural anchor, not how tightly sentences track case facts. The fair comparison holds the predictor set constant (cleaned sample, n=262):</w:t>
+        <w:t xml:space="preserve">? Comparing the demand model against the sentence-from-demand benchmark alone would be misleading: the 64% of sentencing variance explained by the demand (Amien, 2026b) measures how faithfully judges follow a procedural anchor, not how tightly sentences track case facts. The fair comparison holds the predictor set constant (cleaned sample, n=262):</w:t>
       </w:r>
     </w:p>
     <w:tbl>
@@ -1940,7 +2000,7 @@
               <w:pStyle w:val="Compact"/>
             </w:pPr>
             <w:r>
-              <w:t xml:space="preserve">vonis ~ tuntutan (anchor model; Author, 2026b)</w:t>
+              <w:t xml:space="preserve">vonis ~ tuntutan (anchor model; Amien, 2026b)</w:t>
             </w:r>
           </w:p>
         </w:tc>
@@ -1991,7 +2051,7 @@
         <w:t xml:space="preserve">discretion enters the system once — at the demand stage — but judges do not merely transmit it</w:t>
       </w:r>
       <w:r>
-        <w:t xml:space="preserve">. They pull sentences modestly toward case facts, leaving sentences somewhat better tethered to the record than the demands they anchor to. This is partial correction, not pure propagation, and it is consistent with the bidirectional anchoring correction documented for judges in companion work (Author, 2026c). The same direction appears in the elasticities: the sentence-loss elasticity (0.145, SE 0.011) modestly exceeds the demand-loss elasticity (0.124, SE 0.012) — judges weight loss slightly more than prosecutors do — though the two are not statistically distinguishable. The proportionality failure documented in Section 4.1 therefore passes through judicial sentencing</w:t>
+        <w:t xml:space="preserve">. They pull sentences modestly toward case facts, leaving sentences somewhat better tethered to the record than the demands they anchor to. This is partial correction, not pure propagation, and it is consistent with the bidirectional anchoring correction documented for judges in companion work (Amien, 2026c). The same direction appears in the elasticities: the sentence-loss elasticity (0.145, SE 0.011) modestly exceeds the demand-loss elasticity (0.124, SE 0.012) — judges weight loss slightly more than prosecutors do — though the two are not statistically distinguishable. The proportionality failure documented in Section 4.1 therefore passes through judicial sentencing</w:t>
       </w:r>
       <w:r>
         <w:t xml:space="preserve"> </w:t>
@@ -2067,7 +2127,7 @@
         <w:pStyle w:val="BodyText"/>
       </w:pPr>
       <w:r>
-        <w:t xml:space="preserve">The same largely-compositional pattern appears in judicial sentencing (Author, 2026b): most of what looks like regional disparity is case mix rather than systematically harsher or softer local prosecutors.</w:t>
+        <w:t xml:space="preserve">The same largely-compositional pattern appears in judicial sentencing (Amien, 2026b): most of what looks like regional disparity is case mix rather than systematically harsher or softer local prosecutors.</w:t>
       </w:r>
     </w:p>
     <w:bookmarkEnd w:id="24"/>
@@ -2149,7 +2209,7 @@
         <w:t xml:space="preserve"> </w:t>
       </w:r>
       <w:r>
-        <w:t xml:space="preserve">corruption demand — approximately 5-8 years — and adjust insufficiently for case severity. This parallels the judicial anchoring documented in companion studies (Author, 2026b, 2026c). The statutory range of 1-20 years is broad enough to accommodate proportional demands, but prosecutors appear to use only a narrow band within this range.</w:t>
+        <w:t xml:space="preserve">corruption demand — approximately 5-8 years — and adjust insufficiently for case severity. This parallels the judicial anchoring documented in companion studies (Amien, 2026b, 2026c). The statutory range of 1-20 years is broad enough to accommodate proportional demands, but prosecutors appear to use only a narrow band within this range.</w:t>
       </w:r>
     </w:p>
     <w:p>
@@ -2285,7 +2345,7 @@
         <w:t xml:space="preserve"> </w:t>
       </w:r>
       <w:r>
-        <w:t xml:space="preserve">identified in Author (2026b) is thus partly</w:t>
+        <w:t xml:space="preserve">identified in Amien (2026b) is thus partly</w:t>
       </w:r>
       <w:r>
         <w:t xml:space="preserve"> </w:t>
@@ -2591,7 +2651,7 @@
         <w:t xml:space="preserve"> </w:t>
       </w:r>
       <w:r>
-        <w:t xml:space="preserve">The author declares no conflicts of interest.</w:t>
+        <w:t xml:space="preserve">The authors declare no conflicts of interest.</w:t>
       </w:r>
       <w:r>
         <w:t xml:space="preserve"> </w:t>
@@ -2633,13 +2693,29 @@
           <w:b/>
           <w:bCs/>
         </w:rPr>
+        <w:t xml:space="preserve">Author contributions.</w:t>
+      </w:r>
+      <w:r>
+        <w:t xml:space="preserve"> </w:t>
+      </w:r>
+      <w:r>
+        <w:t xml:space="preserve">MA conceived the study, assembled and audited the corpus, and ran the statistical analyses. GFG contributed to the research design, the comparative benchmark, and manuscript revision. Both authors approved the final manuscript.</w:t>
+      </w:r>
+      <w:r>
+        <w:t xml:space="preserve"> </w:t>
+      </w:r>
+      <w:r>
+        <w:rPr>
+          <w:b/>
+          <w:bCs/>
+        </w:rPr>
         <w:t xml:space="preserve">Use of AI-assisted tools.</w:t>
       </w:r>
       <w:r>
         <w:t xml:space="preserve"> </w:t>
       </w:r>
       <w:r>
-        <w:t xml:space="preserve">The author used Claude (Anthropic, Claude Opus) as a computational research assistant for programming, statistical analysis, and manuscript drafting. All analyses were independently verified through reproducible scripts, and the author takes full responsibility for all scientific claims and interpretations.</w:t>
+        <w:t xml:space="preserve">The authors used Claude (Anthropic) as a computational research assistant for programming, statistical analysis, and manuscript drafting. All analyses were independently verified through reproducible scripts, and the authors take full responsibility for all scientific claims and interpretations.</w:t>
       </w:r>
     </w:p>
     <w:bookmarkEnd w:id="33"/>
@@ -2681,39 +2757,23 @@
         <w:pStyle w:val="BodyText"/>
       </w:pPr>
       <w:r>
-        <w:t xml:space="preserve">Author (2026a). CorpusKorupsi: A Computational Corpus of Indonesian Supreme Court Corruption Verdicts and Sentencing Patterns. [Companion paper]</w:t>
-      </w:r>
-    </w:p>
-    <w:p>
-      <w:pPr>
-        <w:pStyle w:val="BodyText"/>
-      </w:pPr>
-      <w:r>
-        <w:t xml:space="preserve">Author (2026b). Charge Type, Judicial Opacity, and the Limits of Prediction: A Computational Analysis of Indonesian Corruption Sentences.</w:t>
-      </w:r>
-      <w:r>
-        <w:t xml:space="preserve"> </w:t>
-      </w:r>
-      <w:r>
-        <w:rPr>
-          <w:i/>
-          <w:iCs/>
-        </w:rPr>
-        <w:t xml:space="preserve">Crime, Law and Social Change</w:t>
-      </w:r>
-      <w:r>
-        <w:t xml:space="preserve"> </w:t>
-      </w:r>
-      <w:r>
-        <w:t xml:space="preserve">[under review].</w:t>
-      </w:r>
-    </w:p>
-    <w:p>
-      <w:pPr>
-        <w:pStyle w:val="BodyText"/>
-      </w:pPr>
-      <w:r>
-        <w:t xml:space="preserve">Author (2026c). Bidirectional Correction: How Indonesian Judges Override Low Prosecution Demands in Corruption Cases. [Companion paper]</w:t>
+        <w:t xml:space="preserve">Amien, M. (2026a). CorpusKorupsi: A Computational Corpus of Indonesian Supreme Court Corruption Verdicts and Sentencing Patterns. [Companion paper]</w:t>
+      </w:r>
+    </w:p>
+    <w:p>
+      <w:pPr>
+        <w:pStyle w:val="BodyText"/>
+      </w:pPr>
+      <w:r>
+        <w:t xml:space="preserve">Amien, M. (2026b). Charge Type, Judicial Opacity, and the Limits of Prediction: A Computational Analysis of Indonesian Corruption Sentences. SSRN Working Paper No. 6574140. https://ssrn.com/abstract=6574140</w:t>
+      </w:r>
+    </w:p>
+    <w:p>
+      <w:pPr>
+        <w:pStyle w:val="BodyText"/>
+      </w:pPr>
+      <w:r>
+        <w:t xml:space="preserve">Amien, M. (2026c). Bidirectional Correction: How Indonesian Judges Override Low Prosecution Demands in Corruption Cases. [Companion paper]</w:t>
       </w:r>
     </w:p>
     <w:p>

</xml_diff>